<commit_message>
Updated wording based on PwC feedback
</commit_message>
<xml_diff>
--- a/Module_2_Oct_2026_v2/Oct12_session1_materials.docx
+++ b/Module_2_Oct_2026_v2/Oct12_session1_materials.docx
@@ -126,7 +126,6 @@
           <w:trHeight w:val="360" w:hRule="auto"/>
           <w:tblHeader/>
         </w:trPr>
-        header 1
         <w:tc>
           <w:tcPr>
             <w:tcBorders>
@@ -146,6 +145,7 @@
           </w:tcPr>
           <w:p>
             <w:pPr>
+              <w:pStyle w:val="Normal"/>
               <w:jc w:val="left"/>
               <w:pBdr>
                 <w:bottom w:val="none" w:sz="0" w:space="0" w:color="000000"/>
@@ -200,6 +200,7 @@
           </w:tcPr>
           <w:p>
             <w:pPr>
+              <w:pStyle w:val="Normal"/>
               <w:jc w:val="left"/>
               <w:pBdr>
                 <w:bottom w:val="none" w:sz="0" w:space="0" w:color="000000"/>
@@ -254,6 +255,7 @@
           </w:tcPr>
           <w:p>
             <w:pPr>
+              <w:pStyle w:val="Normal"/>
               <w:jc w:val="left"/>
               <w:pBdr>
                 <w:bottom w:val="none" w:sz="0" w:space="0" w:color="000000"/>
@@ -294,7 +296,6 @@
         <w:trPr>
           <w:trHeight w:val="360" w:hRule="auto"/>
         </w:trPr>
-        body 1
         <w:tc>
           <w:tcPr>
             <w:tcBorders>
@@ -314,6 +315,7 @@
           </w:tcPr>
           <w:p>
             <w:pPr>
+              <w:pStyle w:val="Normal"/>
               <w:jc w:val="left"/>
               <w:pBdr>
                 <w:bottom w:val="none" w:sz="0" w:space="0" w:color="000000"/>
@@ -368,6 +370,7 @@
           </w:tcPr>
           <w:p>
             <w:pPr>
+              <w:pStyle w:val="Normal"/>
               <w:jc w:val="left"/>
               <w:pBdr>
                 <w:bottom w:val="none" w:sz="0" w:space="0" w:color="000000"/>
@@ -422,6 +425,7 @@
           </w:tcPr>
           <w:p>
             <w:pPr>
+              <w:pStyle w:val="Normal"/>
               <w:jc w:val="left"/>
               <w:pBdr>
                 <w:bottom w:val="none" w:sz="0" w:space="0" w:color="000000"/>
@@ -462,7 +466,6 @@
         <w:trPr>
           <w:trHeight w:val="360" w:hRule="auto"/>
         </w:trPr>
-        body 2
         <w:tc>
           <w:tcPr>
             <w:tcBorders>
@@ -482,6 +485,7 @@
           </w:tcPr>
           <w:p>
             <w:pPr>
+              <w:pStyle w:val="Normal"/>
               <w:jc w:val="left"/>
               <w:pBdr>
                 <w:bottom w:val="none" w:sz="0" w:space="0" w:color="000000"/>
@@ -536,6 +540,7 @@
           </w:tcPr>
           <w:p>
             <w:pPr>
+              <w:pStyle w:val="Normal"/>
               <w:jc w:val="left"/>
               <w:pBdr>
                 <w:bottom w:val="none" w:sz="0" w:space="0" w:color="000000"/>
@@ -590,6 +595,7 @@
           </w:tcPr>
           <w:p>
             <w:pPr>
+              <w:pStyle w:val="Normal"/>
               <w:jc w:val="left"/>
               <w:pBdr>
                 <w:bottom w:val="none" w:sz="0" w:space="0" w:color="000000"/>
@@ -630,7 +636,6 @@
         <w:trPr>
           <w:trHeight w:val="360" w:hRule="auto"/>
         </w:trPr>
-        body 3
         <w:tc>
           <w:tcPr>
             <w:tcBorders>
@@ -650,6 +655,7 @@
           </w:tcPr>
           <w:p>
             <w:pPr>
+              <w:pStyle w:val="Normal"/>
               <w:jc w:val="left"/>
               <w:pBdr>
                 <w:bottom w:val="none" w:sz="0" w:space="0" w:color="000000"/>
@@ -704,6 +710,7 @@
           </w:tcPr>
           <w:p>
             <w:pPr>
+              <w:pStyle w:val="Normal"/>
               <w:jc w:val="left"/>
               <w:pBdr>
                 <w:bottom w:val="none" w:sz="0" w:space="0" w:color="000000"/>
@@ -758,6 +765,7 @@
           </w:tcPr>
           <w:p>
             <w:pPr>
+              <w:pStyle w:val="Normal"/>
               <w:jc w:val="left"/>
               <w:pBdr>
                 <w:bottom w:val="none" w:sz="0" w:space="0" w:color="000000"/>
@@ -798,7 +806,6 @@
         <w:trPr>
           <w:trHeight w:val="360" w:hRule="auto"/>
         </w:trPr>
-        body 4
         <w:tc>
           <w:tcPr>
             <w:tcBorders>
@@ -818,6 +825,7 @@
           </w:tcPr>
           <w:p>
             <w:pPr>
+              <w:pStyle w:val="Normal"/>
               <w:jc w:val="left"/>
               <w:pBdr>
                 <w:bottom w:val="none" w:sz="0" w:space="0" w:color="000000"/>
@@ -872,6 +880,7 @@
           </w:tcPr>
           <w:p>
             <w:pPr>
+              <w:pStyle w:val="Normal"/>
               <w:jc w:val="left"/>
               <w:pBdr>
                 <w:bottom w:val="none" w:sz="0" w:space="0" w:color="000000"/>
@@ -926,6 +935,7 @@
           </w:tcPr>
           <w:p>
             <w:pPr>
+              <w:pStyle w:val="Normal"/>
               <w:jc w:val="left"/>
               <w:pBdr>
                 <w:bottom w:val="none" w:sz="0" w:space="0" w:color="000000"/>
@@ -966,7 +976,6 @@
         <w:trPr>
           <w:trHeight w:val="360" w:hRule="auto"/>
         </w:trPr>
-        body 5
         <w:tc>
           <w:tcPr>
             <w:tcBorders>
@@ -986,6 +995,7 @@
           </w:tcPr>
           <w:p>
             <w:pPr>
+              <w:pStyle w:val="Normal"/>
               <w:jc w:val="left"/>
               <w:pBdr>
                 <w:bottom w:val="none" w:sz="0" w:space="0" w:color="000000"/>
@@ -1040,6 +1050,7 @@
           </w:tcPr>
           <w:p>
             <w:pPr>
+              <w:pStyle w:val="Normal"/>
               <w:jc w:val="left"/>
               <w:pBdr>
                 <w:bottom w:val="none" w:sz="0" w:space="0" w:color="000000"/>
@@ -1094,6 +1105,7 @@
           </w:tcPr>
           <w:p>
             <w:pPr>
+              <w:pStyle w:val="Normal"/>
               <w:jc w:val="left"/>
               <w:pBdr>
                 <w:bottom w:val="none" w:sz="0" w:space="0" w:color="000000"/>
@@ -1134,7 +1146,6 @@
         <w:trPr>
           <w:trHeight w:val="360" w:hRule="auto"/>
         </w:trPr>
-        body 6
         <w:tc>
           <w:tcPr>
             <w:tcBorders>
@@ -1154,6 +1165,7 @@
           </w:tcPr>
           <w:p>
             <w:pPr>
+              <w:pStyle w:val="Normal"/>
               <w:jc w:val="left"/>
               <w:pBdr>
                 <w:bottom w:val="none" w:sz="0" w:space="0" w:color="000000"/>
@@ -1208,6 +1220,7 @@
           </w:tcPr>
           <w:p>
             <w:pPr>
+              <w:pStyle w:val="Normal"/>
               <w:jc w:val="left"/>
               <w:pBdr>
                 <w:bottom w:val="none" w:sz="0" w:space="0" w:color="000000"/>
@@ -1262,6 +1275,7 @@
           </w:tcPr>
           <w:p>
             <w:pPr>
+              <w:pStyle w:val="Normal"/>
               <w:jc w:val="left"/>
               <w:pBdr>
                 <w:bottom w:val="none" w:sz="0" w:space="0" w:color="000000"/>
@@ -1302,7 +1316,6 @@
         <w:trPr>
           <w:trHeight w:val="360" w:hRule="auto"/>
         </w:trPr>
-        body 7
         <w:tc>
           <w:tcPr>
             <w:tcBorders>
@@ -1322,6 +1335,7 @@
           </w:tcPr>
           <w:p>
             <w:pPr>
+              <w:pStyle w:val="Normal"/>
               <w:jc w:val="left"/>
               <w:pBdr>
                 <w:bottom w:val="none" w:sz="0" w:space="0" w:color="000000"/>
@@ -1376,6 +1390,7 @@
           </w:tcPr>
           <w:p>
             <w:pPr>
+              <w:pStyle w:val="Normal"/>
               <w:jc w:val="left"/>
               <w:pBdr>
                 <w:bottom w:val="none" w:sz="0" w:space="0" w:color="000000"/>
@@ -1430,6 +1445,7 @@
           </w:tcPr>
           <w:p>
             <w:pPr>
+              <w:pStyle w:val="Normal"/>
               <w:jc w:val="left"/>
               <w:pBdr>
                 <w:bottom w:val="none" w:sz="0" w:space="0" w:color="000000"/>
@@ -1470,7 +1486,6 @@
         <w:trPr>
           <w:trHeight w:val="360" w:hRule="auto"/>
         </w:trPr>
-        body 8
         <w:tc>
           <w:tcPr>
             <w:tcBorders>
@@ -1490,6 +1505,7 @@
           </w:tcPr>
           <w:p>
             <w:pPr>
+              <w:pStyle w:val="Normal"/>
               <w:jc w:val="left"/>
               <w:pBdr>
                 <w:bottom w:val="none" w:sz="0" w:space="0" w:color="000000"/>
@@ -1544,6 +1560,7 @@
           </w:tcPr>
           <w:p>
             <w:pPr>
+              <w:pStyle w:val="Normal"/>
               <w:jc w:val="left"/>
               <w:pBdr>
                 <w:bottom w:val="none" w:sz="0" w:space="0" w:color="000000"/>
@@ -1598,6 +1615,7 @@
           </w:tcPr>
           <w:p>
             <w:pPr>
+              <w:pStyle w:val="Normal"/>
               <w:jc w:val="left"/>
               <w:pBdr>
                 <w:bottom w:val="none" w:sz="0" w:space="0" w:color="000000"/>
@@ -1638,7 +1656,6 @@
         <w:trPr>
           <w:trHeight w:val="360" w:hRule="auto"/>
         </w:trPr>
-        body 9
         <w:tc>
           <w:tcPr>
             <w:tcBorders>
@@ -1658,6 +1675,7 @@
           </w:tcPr>
           <w:p>
             <w:pPr>
+              <w:pStyle w:val="Normal"/>
               <w:jc w:val="left"/>
               <w:pBdr>
                 <w:bottom w:val="none" w:sz="0" w:space="0" w:color="000000"/>
@@ -1712,6 +1730,7 @@
           </w:tcPr>
           <w:p>
             <w:pPr>
+              <w:pStyle w:val="Normal"/>
               <w:jc w:val="left"/>
               <w:pBdr>
                 <w:bottom w:val="none" w:sz="0" w:space="0" w:color="000000"/>
@@ -1766,6 +1785,7 @@
           </w:tcPr>
           <w:p>
             <w:pPr>
+              <w:pStyle w:val="Normal"/>
               <w:jc w:val="left"/>
               <w:pBdr>
                 <w:bottom w:val="none" w:sz="0" w:space="0" w:color="000000"/>
@@ -1806,7 +1826,6 @@
         <w:trPr>
           <w:trHeight w:val="360" w:hRule="auto"/>
         </w:trPr>
-        body10
         <w:tc>
           <w:tcPr>
             <w:tcBorders>
@@ -1826,6 +1845,7 @@
           </w:tcPr>
           <w:p>
             <w:pPr>
+              <w:pStyle w:val="Normal"/>
               <w:jc w:val="left"/>
               <w:pBdr>
                 <w:bottom w:val="none" w:sz="0" w:space="0" w:color="000000"/>
@@ -1880,6 +1900,7 @@
           </w:tcPr>
           <w:p>
             <w:pPr>
+              <w:pStyle w:val="Normal"/>
               <w:jc w:val="left"/>
               <w:pBdr>
                 <w:bottom w:val="none" w:sz="0" w:space="0" w:color="000000"/>
@@ -1934,6 +1955,7 @@
           </w:tcPr>
           <w:p>
             <w:pPr>
+              <w:pStyle w:val="Normal"/>
               <w:jc w:val="left"/>
               <w:pBdr>
                 <w:bottom w:val="none" w:sz="0" w:space="0" w:color="000000"/>
@@ -2184,7 +2206,7 @@
           <w:szCs w:val="22"/>
           <w:color w:val="000000"/>
         </w:rPr>
-        <w:t xml:space="preserve">Which moved more, and what does that tell you about a reported average?</w:t>
+        <w:t xml:space="preserve">Which changed more, the mean or the median? What does this tell you about an average in a report?</w:t>
       </w:r>
     </w:p>
     <w:p>
@@ -2372,7 +2394,6 @@
           <w:trHeight w:val="360" w:hRule="auto"/>
           <w:tblHeader/>
         </w:trPr>
-        header1
         <w:tc>
           <w:tcPr>
             <w:tcBorders>
@@ -2392,6 +2413,7 @@
           </w:tcPr>
           <w:p>
             <w:pPr>
+              <w:pStyle w:val="Normal"/>
               <w:jc w:val="left"/>
               <w:pBdr>
                 <w:bottom w:val="none" w:sz="0" w:space="0" w:color="000000"/>
@@ -2446,6 +2468,7 @@
           </w:tcPr>
           <w:p>
             <w:pPr>
+              <w:pStyle w:val="Normal"/>
               <w:jc w:val="left"/>
               <w:pBdr>
                 <w:bottom w:val="none" w:sz="0" w:space="0" w:color="000000"/>
@@ -2500,6 +2523,7 @@
           </w:tcPr>
           <w:p>
             <w:pPr>
+              <w:pStyle w:val="Normal"/>
               <w:jc w:val="left"/>
               <w:pBdr>
                 <w:bottom w:val="none" w:sz="0" w:space="0" w:color="000000"/>
@@ -2554,6 +2578,7 @@
           </w:tcPr>
           <w:p>
             <w:pPr>
+              <w:pStyle w:val="Normal"/>
               <w:jc w:val="left"/>
               <w:pBdr>
                 <w:bottom w:val="none" w:sz="0" w:space="0" w:color="000000"/>
@@ -2594,7 +2619,6 @@
         <w:trPr>
           <w:trHeight w:val="360" w:hRule="auto"/>
         </w:trPr>
-        body1
         <w:tc>
           <w:tcPr>
             <w:tcBorders>
@@ -2614,6 +2638,7 @@
           </w:tcPr>
           <w:p>
             <w:pPr>
+              <w:pStyle w:val="Normal"/>
               <w:jc w:val="left"/>
               <w:pBdr>
                 <w:bottom w:val="none" w:sz="0" w:space="0" w:color="000000"/>
@@ -2668,6 +2693,7 @@
           </w:tcPr>
           <w:p>
             <w:pPr>
+              <w:pStyle w:val="Normal"/>
               <w:jc w:val="left"/>
               <w:pBdr>
                 <w:bottom w:val="none" w:sz="0" w:space="0" w:color="000000"/>
@@ -2722,6 +2748,7 @@
           </w:tcPr>
           <w:p>
             <w:pPr>
+              <w:pStyle w:val="Normal"/>
               <w:jc w:val="left"/>
               <w:pBdr>
                 <w:bottom w:val="none" w:sz="0" w:space="0" w:color="000000"/>
@@ -2776,6 +2803,7 @@
           </w:tcPr>
           <w:p>
             <w:pPr>
+              <w:pStyle w:val="Normal"/>
               <w:jc w:val="left"/>
               <w:pBdr>
                 <w:bottom w:val="none" w:sz="0" w:space="0" w:color="000000"/>
@@ -2816,7 +2844,6 @@
         <w:trPr>
           <w:trHeight w:val="360" w:hRule="auto"/>
         </w:trPr>
-        body2
         <w:tc>
           <w:tcPr>
             <w:tcBorders>
@@ -2836,6 +2863,7 @@
           </w:tcPr>
           <w:p>
             <w:pPr>
+              <w:pStyle w:val="Normal"/>
               <w:jc w:val="left"/>
               <w:pBdr>
                 <w:bottom w:val="none" w:sz="0" w:space="0" w:color="000000"/>
@@ -2890,6 +2918,7 @@
           </w:tcPr>
           <w:p>
             <w:pPr>
+              <w:pStyle w:val="Normal"/>
               <w:jc w:val="left"/>
               <w:pBdr>
                 <w:bottom w:val="none" w:sz="0" w:space="0" w:color="000000"/>
@@ -2944,6 +2973,7 @@
           </w:tcPr>
           <w:p>
             <w:pPr>
+              <w:pStyle w:val="Normal"/>
               <w:jc w:val="left"/>
               <w:pBdr>
                 <w:bottom w:val="none" w:sz="0" w:space="0" w:color="000000"/>
@@ -2998,6 +3028,7 @@
           </w:tcPr>
           <w:p>
             <w:pPr>
+              <w:pStyle w:val="Normal"/>
               <w:jc w:val="left"/>
               <w:pBdr>
                 <w:bottom w:val="none" w:sz="0" w:space="0" w:color="000000"/>
@@ -3038,7 +3069,6 @@
         <w:trPr>
           <w:trHeight w:val="360" w:hRule="auto"/>
         </w:trPr>
-        body3
         <w:tc>
           <w:tcPr>
             <w:tcBorders>
@@ -3058,6 +3088,7 @@
           </w:tcPr>
           <w:p>
             <w:pPr>
+              <w:pStyle w:val="Normal"/>
               <w:jc w:val="left"/>
               <w:pBdr>
                 <w:bottom w:val="none" w:sz="0" w:space="0" w:color="000000"/>
@@ -3112,6 +3143,7 @@
           </w:tcPr>
           <w:p>
             <w:pPr>
+              <w:pStyle w:val="Normal"/>
               <w:jc w:val="left"/>
               <w:pBdr>
                 <w:bottom w:val="none" w:sz="0" w:space="0" w:color="000000"/>
@@ -3166,6 +3198,7 @@
           </w:tcPr>
           <w:p>
             <w:pPr>
+              <w:pStyle w:val="Normal"/>
               <w:jc w:val="left"/>
               <w:pBdr>
                 <w:bottom w:val="none" w:sz="0" w:space="0" w:color="000000"/>
@@ -3220,6 +3253,7 @@
           </w:tcPr>
           <w:p>
             <w:pPr>
+              <w:pStyle w:val="Normal"/>
               <w:jc w:val="left"/>
               <w:pBdr>
                 <w:bottom w:val="none" w:sz="0" w:space="0" w:color="000000"/>
@@ -3308,7 +3342,7 @@
           <w:szCs w:val="22"/>
           <w:color w:val="000000"/>
         </w:rPr>
-        <w:t xml:space="preserve">Three numbers describe this result. Write each one and say what it is:</w:t>
+        <w:t xml:space="preserve">Copy these three numbers from your table:</w:t>
       </w:r>
     </w:p>
     <w:p>
@@ -3362,7 +3396,7 @@
           <w:szCs w:val="22"/>
           <w:color w:val="000000"/>
         </w:rPr>
-        <w:t xml:space="preserve">Which is the effect of the cameras on speed, and why not the other two?</w:t>
+        <w:t xml:space="preserve">Which of these three numbers is the effect of the cameras on speed? Why are the other two numbers not the effect?</w:t>
       </w:r>
     </w:p>
     <w:p>
@@ -3443,7 +3477,7 @@
           <w:szCs w:val="26"/>
           <w:color w:val="215A9E"/>
         </w:rPr>
-        <w:t xml:space="preserve">3. Which one would you act on?</w:t>
+        <w:t xml:space="preserve">3. Which report would you act on?</w:t>
       </w:r>
     </w:p>
     <w:p>
@@ -3470,7 +3504,7 @@
           <w:szCs w:val="22"/>
           <w:color w:val="000000"/>
         </w:rPr>
-        <w:t xml:space="preserve">Three evaluations each report 1.8 fewer injury collisions per road. The bar is 2.0. Tick one for each.</w:t>
+        <w:t xml:space="preserve">Three evaluations each report 1.8 fewer injury collisions per road. The decision rule: act only if the cameras prevent at least 2.0 injury collisions per road. For each report, tick one box.</w:t>
       </w:r>
     </w:p>
     <w:tbl xmlns:a="http://schemas.openxmlformats.org/drawingml/2006/main" xmlns:pic="http://schemas.openxmlformats.org/drawingml/2006/picture">
@@ -3491,7 +3525,6 @@
           <w:trHeight w:val="360" w:hRule="auto"/>
           <w:tblHeader/>
         </w:trPr>
-        header1
         <w:tc>
           <w:tcPr>
             <w:tcBorders>
@@ -3511,6 +3544,7 @@
           </w:tcPr>
           <w:p>
             <w:pPr>
+              <w:pStyle w:val="Normal"/>
               <w:jc w:val="left"/>
               <w:pBdr>
                 <w:bottom w:val="none" w:sz="0" w:space="0" w:color="000000"/>
@@ -3565,6 +3599,7 @@
           </w:tcPr>
           <w:p>
             <w:pPr>
+              <w:pStyle w:val="Normal"/>
               <w:jc w:val="left"/>
               <w:pBdr>
                 <w:bottom w:val="none" w:sz="0" w:space="0" w:color="000000"/>
@@ -3619,6 +3654,7 @@
           </w:tcPr>
           <w:p>
             <w:pPr>
+              <w:pStyle w:val="Normal"/>
               <w:jc w:val="left"/>
               <w:pBdr>
                 <w:bottom w:val="none" w:sz="0" w:space="0" w:color="000000"/>
@@ -3673,6 +3709,7 @@
           </w:tcPr>
           <w:p>
             <w:pPr>
+              <w:pStyle w:val="Normal"/>
               <w:jc w:val="left"/>
               <w:pBdr>
                 <w:bottom w:val="none" w:sz="0" w:space="0" w:color="000000"/>
@@ -3727,6 +3764,7 @@
           </w:tcPr>
           <w:p>
             <w:pPr>
+              <w:pStyle w:val="Normal"/>
               <w:jc w:val="left"/>
               <w:pBdr>
                 <w:bottom w:val="none" w:sz="0" w:space="0" w:color="000000"/>
@@ -3767,7 +3805,6 @@
         <w:trPr>
           <w:trHeight w:val="360" w:hRule="auto"/>
         </w:trPr>
-        body1
         <w:tc>
           <w:tcPr>
             <w:tcBorders>
@@ -3787,6 +3824,7 @@
           </w:tcPr>
           <w:p>
             <w:pPr>
+              <w:pStyle w:val="Normal"/>
               <w:jc w:val="left"/>
               <w:pBdr>
                 <w:bottom w:val="none" w:sz="0" w:space="0" w:color="000000"/>
@@ -3841,6 +3879,7 @@
           </w:tcPr>
           <w:p>
             <w:pPr>
+              <w:pStyle w:val="Normal"/>
               <w:jc w:val="left"/>
               <w:pBdr>
                 <w:bottom w:val="none" w:sz="0" w:space="0" w:color="000000"/>
@@ -3895,6 +3934,7 @@
           </w:tcPr>
           <w:p>
             <w:pPr>
+              <w:pStyle w:val="Normal"/>
               <w:jc w:val="left"/>
               <w:pBdr>
                 <w:bottom w:val="none" w:sz="0" w:space="0" w:color="000000"/>
@@ -3949,6 +3989,7 @@
           </w:tcPr>
           <w:p>
             <w:pPr>
+              <w:pStyle w:val="Normal"/>
               <w:jc w:val="left"/>
               <w:pBdr>
                 <w:bottom w:val="none" w:sz="0" w:space="0" w:color="000000"/>
@@ -4003,6 +4044,7 @@
           </w:tcPr>
           <w:p>
             <w:pPr>
+              <w:pStyle w:val="Normal"/>
               <w:jc w:val="left"/>
               <w:pBdr>
                 <w:bottom w:val="none" w:sz="0" w:space="0" w:color="000000"/>
@@ -4043,7 +4085,6 @@
         <w:trPr>
           <w:trHeight w:val="360" w:hRule="auto"/>
         </w:trPr>
-        body2
         <w:tc>
           <w:tcPr>
             <w:tcBorders>
@@ -4063,6 +4104,7 @@
           </w:tcPr>
           <w:p>
             <w:pPr>
+              <w:pStyle w:val="Normal"/>
               <w:jc w:val="left"/>
               <w:pBdr>
                 <w:bottom w:val="none" w:sz="0" w:space="0" w:color="000000"/>
@@ -4117,6 +4159,7 @@
           </w:tcPr>
           <w:p>
             <w:pPr>
+              <w:pStyle w:val="Normal"/>
               <w:jc w:val="left"/>
               <w:pBdr>
                 <w:bottom w:val="none" w:sz="0" w:space="0" w:color="000000"/>
@@ -4171,6 +4214,7 @@
           </w:tcPr>
           <w:p>
             <w:pPr>
+              <w:pStyle w:val="Normal"/>
               <w:jc w:val="left"/>
               <w:pBdr>
                 <w:bottom w:val="none" w:sz="0" w:space="0" w:color="000000"/>
@@ -4225,6 +4269,7 @@
           </w:tcPr>
           <w:p>
             <w:pPr>
+              <w:pStyle w:val="Normal"/>
               <w:jc w:val="left"/>
               <w:pBdr>
                 <w:bottom w:val="none" w:sz="0" w:space="0" w:color="000000"/>
@@ -4279,6 +4324,7 @@
           </w:tcPr>
           <w:p>
             <w:pPr>
+              <w:pStyle w:val="Normal"/>
               <w:jc w:val="left"/>
               <w:pBdr>
                 <w:bottom w:val="none" w:sz="0" w:space="0" w:color="000000"/>
@@ -4319,7 +4365,6 @@
         <w:trPr>
           <w:trHeight w:val="360" w:hRule="auto"/>
         </w:trPr>
-        body3
         <w:tc>
           <w:tcPr>
             <w:tcBorders>
@@ -4339,6 +4384,7 @@
           </w:tcPr>
           <w:p>
             <w:pPr>
+              <w:pStyle w:val="Normal"/>
               <w:jc w:val="left"/>
               <w:pBdr>
                 <w:bottom w:val="none" w:sz="0" w:space="0" w:color="000000"/>
@@ -4393,6 +4439,7 @@
           </w:tcPr>
           <w:p>
             <w:pPr>
+              <w:pStyle w:val="Normal"/>
               <w:jc w:val="left"/>
               <w:pBdr>
                 <w:bottom w:val="none" w:sz="0" w:space="0" w:color="000000"/>
@@ -4447,6 +4494,7 @@
           </w:tcPr>
           <w:p>
             <w:pPr>
+              <w:pStyle w:val="Normal"/>
               <w:jc w:val="left"/>
               <w:pBdr>
                 <w:bottom w:val="none" w:sz="0" w:space="0" w:color="000000"/>
@@ -4501,6 +4549,7 @@
           </w:tcPr>
           <w:p>
             <w:pPr>
+              <w:pStyle w:val="Normal"/>
               <w:jc w:val="left"/>
               <w:pBdr>
                 <w:bottom w:val="none" w:sz="0" w:space="0" w:color="000000"/>
@@ -4555,6 +4604,7 @@
           </w:tcPr>
           <w:p>
             <w:pPr>
+              <w:pStyle w:val="Normal"/>
               <w:jc w:val="left"/>
               <w:pBdr>
                 <w:bottom w:val="none" w:sz="0" w:space="0" w:color="000000"/>
@@ -4720,7 +4770,6 @@
         <w:trPr>
           <w:trHeight w:val="4608" w:hRule="atLeast"/>
         </w:trPr>
-        body1
         <w:tc>
           <w:tcPr>
             <w:tcBorders>
@@ -4740,6 +4789,7 @@
           </w:tcPr>
           <w:p>
             <w:pPr>
+              <w:pStyle w:val="Normal"/>
               <w:jc w:val="left"/>
               <w:pBdr>
                 <w:bottom w:val="none" w:sz="0" w:space="0" w:color="000000"/>
@@ -4862,7 +4912,7 @@
                 <w:szCs w:val="21"/>
                 <w:color w:val="000000"/>
               </w:rPr>
-              <w:t xml:space="preserve">What did it get wrong or overstate?</w:t>
+              <w:t xml:space="preserve">Did the AI's answer contain mistakes, or claim more than is true?</w:t>
             </w:r>
             <w:r>
               <w:rPr>
@@ -4924,6 +4974,7 @@
           </w:tcPr>
           <w:p>
             <w:pPr>
+              <w:pStyle w:val="Normal"/>
               <w:jc w:val="left"/>
               <w:pBdr>
                 <w:bottom w:val="none" w:sz="0" w:space="0" w:color="000000"/>
@@ -5046,7 +5097,7 @@
                 <w:szCs w:val="21"/>
                 <w:color w:val="000000"/>
               </w:rPr>
-              <w:t xml:space="preserve">What did it get wrong or overstate?</w:t>
+              <w:t xml:space="preserve">Did the AI's answer contain mistakes, or claim more than is true?</w:t>
             </w:r>
             <w:r>
               <w:rPr>
@@ -5094,7 +5145,6 @@
         <w:trPr>
           <w:trHeight w:val="4608" w:hRule="atLeast"/>
         </w:trPr>
-        body2
         <w:tc>
           <w:tcPr>
             <w:tcBorders>
@@ -5114,6 +5164,7 @@
           </w:tcPr>
           <w:p>
             <w:pPr>
+              <w:pStyle w:val="Normal"/>
               <w:jc w:val="left"/>
               <w:pBdr>
                 <w:bottom w:val="none" w:sz="0" w:space="0" w:color="000000"/>
@@ -5236,7 +5287,7 @@
                 <w:szCs w:val="21"/>
                 <w:color w:val="000000"/>
               </w:rPr>
-              <w:t xml:space="preserve">Did it ask what the 32% was compared with?</w:t>
+              <w:t xml:space="preserve">Did the AI ask what the 32% was compared with?</w:t>
             </w:r>
             <w:r>
               <w:rPr>
@@ -5298,6 +5349,7 @@
           </w:tcPr>
           <w:p>
             <w:pPr>
+              <w:pStyle w:val="Normal"/>
               <w:jc w:val="left"/>
               <w:pBdr>
                 <w:bottom w:val="none" w:sz="0" w:space="0" w:color="000000"/>
@@ -5420,7 +5472,7 @@
                 <w:szCs w:val="21"/>
                 <w:color w:val="000000"/>
               </w:rPr>
-              <w:t xml:space="preserve">Did it give you advice about schools?</w:t>
+              <w:t xml:space="preserve">Did the AI give you advice about schools?</w:t>
             </w:r>
             <w:r>
               <w:rPr>
@@ -5576,7 +5628,7 @@
           <w:szCs w:val="22"/>
           <w:color w:val="000000"/>
         </w:rPr>
-        <w:t xml:space="preserve">You are the commissioner. Eight sentences from reports on the camera programme land on your desk. For each one: which of the three questions does it leave unanswered, and what do you do with it?</w:t>
+        <w:t xml:space="preserve">You are the commissioner. You receive eight sentences from reports on the camera programme. For each sentence: which of the three questions (compared to what? how big? how sure?) does the sentence not answer? Would you act on the sentence, not act, or ask a question first?</w:t>
       </w:r>
     </w:p>
     <w:tbl xmlns:a="http://schemas.openxmlformats.org/drawingml/2006/main" xmlns:pic="http://schemas.openxmlformats.org/drawingml/2006/picture">
@@ -5596,7 +5648,6 @@
           <w:trHeight w:val="360" w:hRule="auto"/>
           <w:tblHeader/>
         </w:trPr>
-        header1
         <w:tc>
           <w:tcPr>
             <w:tcBorders>
@@ -5616,6 +5667,7 @@
           </w:tcPr>
           <w:p>
             <w:pPr>
+              <w:pStyle w:val="Normal"/>
               <w:jc w:val="left"/>
               <w:pBdr>
                 <w:bottom w:val="none" w:sz="0" w:space="0" w:color="000000"/>
@@ -5670,6 +5722,7 @@
           </w:tcPr>
           <w:p>
             <w:pPr>
+              <w:pStyle w:val="Normal"/>
               <w:jc w:val="left"/>
               <w:pBdr>
                 <w:bottom w:val="none" w:sz="0" w:space="0" w:color="000000"/>
@@ -5701,7 +5754,7 @@
                 <w:szCs w:val="21"/>
                 <w:color w:val="063360"/>
               </w:rPr>
-              <w:t xml:space="preserve">Unanswered: compared to what? / how big? / how sure? / none</w:t>
+              <w:t xml:space="preserve">Question the sentence does not answer: compared to what? / how big? / how sure? / none</w:t>
             </w:r>
           </w:p>
         </w:tc>
@@ -5724,6 +5777,7 @@
           </w:tcPr>
           <w:p>
             <w:pPr>
+              <w:pStyle w:val="Normal"/>
               <w:jc w:val="left"/>
               <w:pBdr>
                 <w:bottom w:val="none" w:sz="0" w:space="0" w:color="000000"/>
@@ -5778,6 +5832,7 @@
           </w:tcPr>
           <w:p>
             <w:pPr>
+              <w:pStyle w:val="Normal"/>
               <w:jc w:val="left"/>
               <w:pBdr>
                 <w:bottom w:val="none" w:sz="0" w:space="0" w:color="000000"/>
@@ -5809,7 +5864,7 @@
                 <w:szCs w:val="21"/>
                 <w:color w:val="063360"/>
               </w:rPr>
-              <w:t xml:space="preserve">The question you would send back</w:t>
+              <w:t xml:space="preserve">The question you would ask the evaluator</w:t>
             </w:r>
           </w:p>
         </w:tc>
@@ -5818,7 +5873,6 @@
         <w:trPr>
           <w:trHeight w:val="792" w:hRule="atLeast"/>
         </w:trPr>
-        body1
         <w:tc>
           <w:tcPr>
             <w:tcBorders>
@@ -5838,6 +5892,7 @@
           </w:tcPr>
           <w:p>
             <w:pPr>
+              <w:pStyle w:val="Normal"/>
               <w:jc w:val="left"/>
               <w:pBdr>
                 <w:bottom w:val="none" w:sz="0" w:space="0" w:color="000000"/>
@@ -5892,6 +5947,7 @@
           </w:tcPr>
           <w:p>
             <w:pPr>
+              <w:pStyle w:val="Normal"/>
               <w:jc w:val="left"/>
               <w:pBdr>
                 <w:bottom w:val="none" w:sz="0" w:space="0" w:color="000000"/>
@@ -5946,6 +6002,7 @@
           </w:tcPr>
           <w:p>
             <w:pPr>
+              <w:pStyle w:val="Normal"/>
               <w:jc w:val="left"/>
               <w:pBdr>
                 <w:bottom w:val="none" w:sz="0" w:space="0" w:color="000000"/>
@@ -6000,6 +6057,7 @@
           </w:tcPr>
           <w:p>
             <w:pPr>
+              <w:pStyle w:val="Normal"/>
               <w:jc w:val="left"/>
               <w:pBdr>
                 <w:bottom w:val="none" w:sz="0" w:space="0" w:color="000000"/>
@@ -6040,7 +6098,6 @@
         <w:trPr>
           <w:trHeight w:val="792" w:hRule="atLeast"/>
         </w:trPr>
-        body2
         <w:tc>
           <w:tcPr>
             <w:tcBorders>
@@ -6060,6 +6117,7 @@
           </w:tcPr>
           <w:p>
             <w:pPr>
+              <w:pStyle w:val="Normal"/>
               <w:jc w:val="left"/>
               <w:pBdr>
                 <w:bottom w:val="none" w:sz="0" w:space="0" w:color="000000"/>
@@ -6114,6 +6172,7 @@
           </w:tcPr>
           <w:p>
             <w:pPr>
+              <w:pStyle w:val="Normal"/>
               <w:jc w:val="left"/>
               <w:pBdr>
                 <w:bottom w:val="none" w:sz="0" w:space="0" w:color="000000"/>
@@ -6168,6 +6227,7 @@
           </w:tcPr>
           <w:p>
             <w:pPr>
+              <w:pStyle w:val="Normal"/>
               <w:jc w:val="left"/>
               <w:pBdr>
                 <w:bottom w:val="none" w:sz="0" w:space="0" w:color="000000"/>
@@ -6222,6 +6282,7 @@
           </w:tcPr>
           <w:p>
             <w:pPr>
+              <w:pStyle w:val="Normal"/>
               <w:jc w:val="left"/>
               <w:pBdr>
                 <w:bottom w:val="none" w:sz="0" w:space="0" w:color="000000"/>
@@ -6262,7 +6323,6 @@
         <w:trPr>
           <w:trHeight w:val="792" w:hRule="atLeast"/>
         </w:trPr>
-        body3
         <w:tc>
           <w:tcPr>
             <w:tcBorders>
@@ -6282,6 +6342,7 @@
           </w:tcPr>
           <w:p>
             <w:pPr>
+              <w:pStyle w:val="Normal"/>
               <w:jc w:val="left"/>
               <w:pBdr>
                 <w:bottom w:val="none" w:sz="0" w:space="0" w:color="000000"/>
@@ -6336,6 +6397,7 @@
           </w:tcPr>
           <w:p>
             <w:pPr>
+              <w:pStyle w:val="Normal"/>
               <w:jc w:val="left"/>
               <w:pBdr>
                 <w:bottom w:val="none" w:sz="0" w:space="0" w:color="000000"/>
@@ -6390,6 +6452,7 @@
           </w:tcPr>
           <w:p>
             <w:pPr>
+              <w:pStyle w:val="Normal"/>
               <w:jc w:val="left"/>
               <w:pBdr>
                 <w:bottom w:val="none" w:sz="0" w:space="0" w:color="000000"/>
@@ -6444,6 +6507,7 @@
           </w:tcPr>
           <w:p>
             <w:pPr>
+              <w:pStyle w:val="Normal"/>
               <w:jc w:val="left"/>
               <w:pBdr>
                 <w:bottom w:val="none" w:sz="0" w:space="0" w:color="000000"/>
@@ -6484,7 +6548,6 @@
         <w:trPr>
           <w:trHeight w:val="792" w:hRule="atLeast"/>
         </w:trPr>
-        body4
         <w:tc>
           <w:tcPr>
             <w:tcBorders>
@@ -6504,6 +6567,7 @@
           </w:tcPr>
           <w:p>
             <w:pPr>
+              <w:pStyle w:val="Normal"/>
               <w:jc w:val="left"/>
               <w:pBdr>
                 <w:bottom w:val="none" w:sz="0" w:space="0" w:color="000000"/>
@@ -6558,6 +6622,7 @@
           </w:tcPr>
           <w:p>
             <w:pPr>
+              <w:pStyle w:val="Normal"/>
               <w:jc w:val="left"/>
               <w:pBdr>
                 <w:bottom w:val="none" w:sz="0" w:space="0" w:color="000000"/>
@@ -6612,6 +6677,7 @@
           </w:tcPr>
           <w:p>
             <w:pPr>
+              <w:pStyle w:val="Normal"/>
               <w:jc w:val="left"/>
               <w:pBdr>
                 <w:bottom w:val="none" w:sz="0" w:space="0" w:color="000000"/>
@@ -6666,6 +6732,7 @@
           </w:tcPr>
           <w:p>
             <w:pPr>
+              <w:pStyle w:val="Normal"/>
               <w:jc w:val="left"/>
               <w:pBdr>
                 <w:bottom w:val="none" w:sz="0" w:space="0" w:color="000000"/>
@@ -6706,7 +6773,6 @@
         <w:trPr>
           <w:trHeight w:val="792" w:hRule="atLeast"/>
         </w:trPr>
-        body5
         <w:tc>
           <w:tcPr>
             <w:tcBorders>
@@ -6726,6 +6792,7 @@
           </w:tcPr>
           <w:p>
             <w:pPr>
+              <w:pStyle w:val="Normal"/>
               <w:jc w:val="left"/>
               <w:pBdr>
                 <w:bottom w:val="none" w:sz="0" w:space="0" w:color="000000"/>
@@ -6780,6 +6847,7 @@
           </w:tcPr>
           <w:p>
             <w:pPr>
+              <w:pStyle w:val="Normal"/>
               <w:jc w:val="left"/>
               <w:pBdr>
                 <w:bottom w:val="none" w:sz="0" w:space="0" w:color="000000"/>
@@ -6834,6 +6902,7 @@
           </w:tcPr>
           <w:p>
             <w:pPr>
+              <w:pStyle w:val="Normal"/>
               <w:jc w:val="left"/>
               <w:pBdr>
                 <w:bottom w:val="none" w:sz="0" w:space="0" w:color="000000"/>
@@ -6888,6 +6957,7 @@
           </w:tcPr>
           <w:p>
             <w:pPr>
+              <w:pStyle w:val="Normal"/>
               <w:jc w:val="left"/>
               <w:pBdr>
                 <w:bottom w:val="none" w:sz="0" w:space="0" w:color="000000"/>
@@ -6928,7 +6998,6 @@
         <w:trPr>
           <w:trHeight w:val="792" w:hRule="atLeast"/>
         </w:trPr>
-        body6
         <w:tc>
           <w:tcPr>
             <w:tcBorders>
@@ -6948,6 +7017,7 @@
           </w:tcPr>
           <w:p>
             <w:pPr>
+              <w:pStyle w:val="Normal"/>
               <w:jc w:val="left"/>
               <w:pBdr>
                 <w:bottom w:val="none" w:sz="0" w:space="0" w:color="000000"/>
@@ -7002,6 +7072,7 @@
           </w:tcPr>
           <w:p>
             <w:pPr>
+              <w:pStyle w:val="Normal"/>
               <w:jc w:val="left"/>
               <w:pBdr>
                 <w:bottom w:val="none" w:sz="0" w:space="0" w:color="000000"/>
@@ -7056,6 +7127,7 @@
           </w:tcPr>
           <w:p>
             <w:pPr>
+              <w:pStyle w:val="Normal"/>
               <w:jc w:val="left"/>
               <w:pBdr>
                 <w:bottom w:val="none" w:sz="0" w:space="0" w:color="000000"/>
@@ -7110,6 +7182,7 @@
           </w:tcPr>
           <w:p>
             <w:pPr>
+              <w:pStyle w:val="Normal"/>
               <w:jc w:val="left"/>
               <w:pBdr>
                 <w:bottom w:val="none" w:sz="0" w:space="0" w:color="000000"/>
@@ -7150,7 +7223,6 @@
         <w:trPr>
           <w:trHeight w:val="792" w:hRule="atLeast"/>
         </w:trPr>
-        body7
         <w:tc>
           <w:tcPr>
             <w:tcBorders>
@@ -7170,6 +7242,7 @@
           </w:tcPr>
           <w:p>
             <w:pPr>
+              <w:pStyle w:val="Normal"/>
               <w:jc w:val="left"/>
               <w:pBdr>
                 <w:bottom w:val="none" w:sz="0" w:space="0" w:color="000000"/>
@@ -7224,6 +7297,7 @@
           </w:tcPr>
           <w:p>
             <w:pPr>
+              <w:pStyle w:val="Normal"/>
               <w:jc w:val="left"/>
               <w:pBdr>
                 <w:bottom w:val="none" w:sz="0" w:space="0" w:color="000000"/>
@@ -7278,6 +7352,7 @@
           </w:tcPr>
           <w:p>
             <w:pPr>
+              <w:pStyle w:val="Normal"/>
               <w:jc w:val="left"/>
               <w:pBdr>
                 <w:bottom w:val="none" w:sz="0" w:space="0" w:color="000000"/>
@@ -7332,6 +7407,7 @@
           </w:tcPr>
           <w:p>
             <w:pPr>
+              <w:pStyle w:val="Normal"/>
               <w:jc w:val="left"/>
               <w:pBdr>
                 <w:bottom w:val="none" w:sz="0" w:space="0" w:color="000000"/>
@@ -7372,7 +7448,6 @@
         <w:trPr>
           <w:trHeight w:val="792" w:hRule="atLeast"/>
         </w:trPr>
-        body8
         <w:tc>
           <w:tcPr>
             <w:tcBorders>
@@ -7392,6 +7467,7 @@
           </w:tcPr>
           <w:p>
             <w:pPr>
+              <w:pStyle w:val="Normal"/>
               <w:jc w:val="left"/>
               <w:pBdr>
                 <w:bottom w:val="none" w:sz="0" w:space="0" w:color="000000"/>
@@ -7446,6 +7522,7 @@
           </w:tcPr>
           <w:p>
             <w:pPr>
+              <w:pStyle w:val="Normal"/>
               <w:jc w:val="left"/>
               <w:pBdr>
                 <w:bottom w:val="none" w:sz="0" w:space="0" w:color="000000"/>
@@ -7500,6 +7577,7 @@
           </w:tcPr>
           <w:p>
             <w:pPr>
+              <w:pStyle w:val="Normal"/>
               <w:jc w:val="left"/>
               <w:pBdr>
                 <w:bottom w:val="none" w:sz="0" w:space="0" w:color="000000"/>
@@ -7554,6 +7632,7 @@
           </w:tcPr>
           <w:p>
             <w:pPr>
+              <w:pStyle w:val="Normal"/>
               <w:jc w:val="left"/>
               <w:pBdr>
                 <w:bottom w:val="none" w:sz="0" w:space="0" w:color="000000"/>
@@ -7615,7 +7694,7 @@
           <w:szCs w:val="22"/>
           <w:color w:val="000000"/>
         </w:rPr>
-        <w:t xml:space="preserve">Then pick the one excerpt you would be most tempted to act on, and say what would have to be true first.</w:t>
+        <w:t xml:space="preserve">Which excerpt would you most want to act on? What would you need to know before acting on that excerpt?</w:t>
       </w:r>
     </w:p>
     <w:p>
@@ -7773,7 +7852,6 @@
         <w:trPr>
           <w:trHeight w:val="1584" w:hRule="atLeast"/>
         </w:trPr>
-        body1
         <w:tc>
           <w:tcPr>
             <w:tcBorders>
@@ -7793,6 +7871,7 @@
           </w:tcPr>
           <w:p>
             <w:pPr>
+              <w:pStyle w:val="Normal"/>
               <w:jc w:val="left"/>
               <w:pBdr>
                 <w:bottom w:val="none" w:sz="0" w:space="0" w:color="000000"/>
@@ -7873,6 +7952,7 @@
           </w:tcPr>
           <w:p>
             <w:pPr>
+              <w:pStyle w:val="Normal"/>
               <w:jc w:val="left"/>
               <w:pBdr>
                 <w:bottom w:val="none" w:sz="0" w:space="0" w:color="000000"/>
@@ -7939,7 +8019,6 @@
         <w:trPr>
           <w:trHeight w:val="1584" w:hRule="atLeast"/>
         </w:trPr>
-        body2
         <w:tc>
           <w:tcPr>
             <w:tcBorders>
@@ -7959,6 +8038,7 @@
           </w:tcPr>
           <w:p>
             <w:pPr>
+              <w:pStyle w:val="Normal"/>
               <w:jc w:val="left"/>
               <w:pBdr>
                 <w:bottom w:val="none" w:sz="0" w:space="0" w:color="000000"/>
@@ -8039,6 +8119,7 @@
           </w:tcPr>
           <w:p>
             <w:pPr>
+              <w:pStyle w:val="Normal"/>
               <w:jc w:val="left"/>
               <w:pBdr>
                 <w:bottom w:val="none" w:sz="0" w:space="0" w:color="000000"/>
@@ -8105,7 +8186,6 @@
         <w:trPr>
           <w:trHeight w:val="1584" w:hRule="atLeast"/>
         </w:trPr>
-        body3
         <w:tc>
           <w:tcPr>
             <w:tcBorders>
@@ -8125,6 +8205,7 @@
           </w:tcPr>
           <w:p>
             <w:pPr>
+              <w:pStyle w:val="Normal"/>
               <w:jc w:val="left"/>
               <w:pBdr>
                 <w:bottom w:val="none" w:sz="0" w:space="0" w:color="000000"/>
@@ -8205,6 +8286,7 @@
           </w:tcPr>
           <w:p>
             <w:pPr>
+              <w:pStyle w:val="Normal"/>
               <w:jc w:val="left"/>
               <w:pBdr>
                 <w:bottom w:val="none" w:sz="0" w:space="0" w:color="000000"/>
@@ -8271,7 +8353,6 @@
         <w:trPr>
           <w:trHeight w:val="1584" w:hRule="atLeast"/>
         </w:trPr>
-        body4
         <w:tc>
           <w:tcPr>
             <w:tcBorders>
@@ -8291,6 +8372,7 @@
           </w:tcPr>
           <w:p>
             <w:pPr>
+              <w:pStyle w:val="Normal"/>
               <w:jc w:val="left"/>
               <w:pBdr>
                 <w:bottom w:val="none" w:sz="0" w:space="0" w:color="000000"/>
@@ -8371,6 +8453,7 @@
           </w:tcPr>
           <w:p>
             <w:pPr>
+              <w:pStyle w:val="Normal"/>
               <w:jc w:val="left"/>
               <w:pBdr>
                 <w:bottom w:val="none" w:sz="0" w:space="0" w:color="000000"/>
@@ -8562,7 +8645,6 @@
         <w:trPr>
           <w:trHeight w:val="2592" w:hRule="atLeast"/>
         </w:trPr>
-        body1
         <w:tc>
           <w:tcPr>
             <w:tcBorders>
@@ -8582,6 +8664,7 @@
           </w:tcPr>
           <w:p>
             <w:pPr>
+              <w:pStyle w:val="Normal"/>
               <w:jc w:val="left"/>
               <w:pBdr>
                 <w:bottom w:val="none" w:sz="0" w:space="0" w:color="000000"/>
@@ -8665,7 +8748,7 @@
                 <w:szCs w:val="21"/>
                 <w:color w:val="000000"/>
               </w:rPr>
-              <w:t xml:space="preserve">2. How big is it, in units that matter to the decision?</w:t>
+              <w:t xml:space="preserve">2. How big is the number, in units that matter to the decision?</w:t>
             </w:r>
             <w:r>
               <w:rPr>
@@ -8730,7 +8813,7 @@
                 <w:szCs w:val="21"/>
                 <w:color w:val="000000"/>
               </w:rPr>
-              <w:t xml:space="preserve">On my desk, I will ask these about:</w:t>
+              <w:t xml:space="preserve">Back at work, I will ask these questions about:</w:t>
             </w:r>
             <w:r>
               <w:rPr>
@@ -8779,6 +8862,7 @@
           </w:tcPr>
           <w:p>
             <w:pPr>
+              <w:pStyle w:val="Normal"/>
               <w:jc w:val="left"/>
               <w:pBdr>
                 <w:bottom w:val="none" w:sz="0" w:space="0" w:color="000000"/>
@@ -8862,7 +8946,7 @@
                 <w:szCs w:val="21"/>
                 <w:color w:val="000000"/>
               </w:rPr>
-              <w:t xml:space="preserve">2. How big is it, in units that matter to the decision?</w:t>
+              <w:t xml:space="preserve">2. How big is the number, in units that matter to the decision?</w:t>
             </w:r>
             <w:r>
               <w:rPr>
@@ -8927,7 +9011,7 @@
                 <w:szCs w:val="21"/>
                 <w:color w:val="000000"/>
               </w:rPr>
-              <w:t xml:space="preserve">On my desk, I will ask these about:</w:t>
+              <w:t xml:space="preserve">Back at work, I will ask these questions about:</w:t>
             </w:r>
             <w:r>
               <w:rPr>
@@ -8962,7 +9046,6 @@
         <w:trPr>
           <w:trHeight w:val="2592" w:hRule="atLeast"/>
         </w:trPr>
-        body2
         <w:tc>
           <w:tcPr>
             <w:tcBorders>
@@ -8982,6 +9065,7 @@
           </w:tcPr>
           <w:p>
             <w:pPr>
+              <w:pStyle w:val="Normal"/>
               <w:jc w:val="left"/>
               <w:pBdr>
                 <w:bottom w:val="none" w:sz="0" w:space="0" w:color="000000"/>
@@ -9065,7 +9149,7 @@
                 <w:szCs w:val="21"/>
                 <w:color w:val="000000"/>
               </w:rPr>
-              <w:t xml:space="preserve">2. How big is it, in units that matter to the decision?</w:t>
+              <w:t xml:space="preserve">2. How big is the number, in units that matter to the decision?</w:t>
             </w:r>
             <w:r>
               <w:rPr>
@@ -9130,7 +9214,7 @@
                 <w:szCs w:val="21"/>
                 <w:color w:val="000000"/>
               </w:rPr>
-              <w:t xml:space="preserve">On my desk, I will ask these about:</w:t>
+              <w:t xml:space="preserve">Back at work, I will ask these questions about:</w:t>
             </w:r>
             <w:r>
               <w:rPr>
@@ -9179,6 +9263,7 @@
           </w:tcPr>
           <w:p>
             <w:pPr>
+              <w:pStyle w:val="Normal"/>
               <w:jc w:val="left"/>
               <w:pBdr>
                 <w:bottom w:val="none" w:sz="0" w:space="0" w:color="000000"/>
@@ -9262,7 +9347,7 @@
                 <w:szCs w:val="21"/>
                 <w:color w:val="000000"/>
               </w:rPr>
-              <w:t xml:space="preserve">2. How big is it, in units that matter to the decision?</w:t>
+              <w:t xml:space="preserve">2. How big is the number, in units that matter to the decision?</w:t>
             </w:r>
             <w:r>
               <w:rPr>
@@ -9327,7 +9412,7 @@
                 <w:szCs w:val="21"/>
                 <w:color w:val="000000"/>
               </w:rPr>
-              <w:t xml:space="preserve">On my desk, I will ask these about:</w:t>
+              <w:t xml:space="preserve">Back at work, I will ask these questions about:</w:t>
             </w:r>
             <w:r>
               <w:rPr>
@@ -9362,7 +9447,6 @@
         <w:trPr>
           <w:trHeight w:val="2592" w:hRule="atLeast"/>
         </w:trPr>
-        body3
         <w:tc>
           <w:tcPr>
             <w:tcBorders>
@@ -9382,6 +9466,7 @@
           </w:tcPr>
           <w:p>
             <w:pPr>
+              <w:pStyle w:val="Normal"/>
               <w:jc w:val="left"/>
               <w:pBdr>
                 <w:bottom w:val="none" w:sz="0" w:space="0" w:color="000000"/>
@@ -9465,7 +9550,7 @@
                 <w:szCs w:val="21"/>
                 <w:color w:val="000000"/>
               </w:rPr>
-              <w:t xml:space="preserve">2. How big is it, in units that matter to the decision?</w:t>
+              <w:t xml:space="preserve">2. How big is the number, in units that matter to the decision?</w:t>
             </w:r>
             <w:r>
               <w:rPr>
@@ -9530,7 +9615,7 @@
                 <w:szCs w:val="21"/>
                 <w:color w:val="000000"/>
               </w:rPr>
-              <w:t xml:space="preserve">On my desk, I will ask these about:</w:t>
+              <w:t xml:space="preserve">Back at work, I will ask these questions about:</w:t>
             </w:r>
             <w:r>
               <w:rPr>
@@ -9579,6 +9664,7 @@
           </w:tcPr>
           <w:p>
             <w:pPr>
+              <w:pStyle w:val="Normal"/>
               <w:jc w:val="left"/>
               <w:pBdr>
                 <w:bottom w:val="none" w:sz="0" w:space="0" w:color="000000"/>
@@ -9662,7 +9748,7 @@
                 <w:szCs w:val="21"/>
                 <w:color w:val="000000"/>
               </w:rPr>
-              <w:t xml:space="preserve">2. How big is it, in units that matter to the decision?</w:t>
+              <w:t xml:space="preserve">2. How big is the number, in units that matter to the decision?</w:t>
             </w:r>
             <w:r>
               <w:rPr>
@@ -9727,7 +9813,7 @@
                 <w:szCs w:val="21"/>
                 <w:color w:val="000000"/>
               </w:rPr>
-              <w:t xml:space="preserve">On my desk, I will ask these about:</w:t>
+              <w:t xml:space="preserve">Back at work, I will ask these questions about:</w:t>
             </w:r>
             <w:r>
               <w:rPr>
@@ -9762,7 +9848,6 @@
         <w:trPr>
           <w:trHeight w:val="2592" w:hRule="atLeast"/>
         </w:trPr>
-        body4
         <w:tc>
           <w:tcPr>
             <w:tcBorders>
@@ -9782,6 +9867,7 @@
           </w:tcPr>
           <w:p>
             <w:pPr>
+              <w:pStyle w:val="Normal"/>
               <w:jc w:val="left"/>
               <w:pBdr>
                 <w:bottom w:val="none" w:sz="0" w:space="0" w:color="000000"/>
@@ -9865,7 +9951,7 @@
                 <w:szCs w:val="21"/>
                 <w:color w:val="000000"/>
               </w:rPr>
-              <w:t xml:space="preserve">2. How big is it, in units that matter to the decision?</w:t>
+              <w:t xml:space="preserve">2. How big is the number, in units that matter to the decision?</w:t>
             </w:r>
             <w:r>
               <w:rPr>
@@ -9930,7 +10016,7 @@
                 <w:szCs w:val="21"/>
                 <w:color w:val="000000"/>
               </w:rPr>
-              <w:t xml:space="preserve">On my desk, I will ask these about:</w:t>
+              <w:t xml:space="preserve">Back at work, I will ask these questions about:</w:t>
             </w:r>
             <w:r>
               <w:rPr>
@@ -9979,6 +10065,7 @@
           </w:tcPr>
           <w:p>
             <w:pPr>
+              <w:pStyle w:val="Normal"/>
               <w:jc w:val="left"/>
               <w:pBdr>
                 <w:bottom w:val="none" w:sz="0" w:space="0" w:color="000000"/>
@@ -10062,7 +10149,7 @@
                 <w:szCs w:val="21"/>
                 <w:color w:val="000000"/>
               </w:rPr>
-              <w:t xml:space="preserve">2. How big is it, in units that matter to the decision?</w:t>
+              <w:t xml:space="preserve">2. How big is the number, in units that matter to the decision?</w:t>
             </w:r>
             <w:r>
               <w:rPr>
@@ -10127,7 +10214,7 @@
                 <w:szCs w:val="21"/>
                 <w:color w:val="000000"/>
               </w:rPr>
-              <w:t xml:space="preserve">On my desk, I will ask these about:</w:t>
+              <w:t xml:space="preserve">Back at work, I will ask these questions about:</w:t>
             </w:r>
             <w:r>
               <w:rPr>
@@ -10505,7 +10592,6 @@
           <w:trHeight w:val="360" w:hRule="auto"/>
           <w:tblHeader/>
         </w:trPr>
-        header1
         <w:tc>
           <w:tcPr>
             <w:tcBorders>
@@ -10525,6 +10611,7 @@
           </w:tcPr>
           <w:p>
             <w:pPr>
+              <w:pStyle w:val="Normal"/>
               <w:jc w:val="left"/>
               <w:pBdr>
                 <w:bottom w:val="none" w:sz="0" w:space="0" w:color="000000"/>
@@ -10579,6 +10666,7 @@
           </w:tcPr>
           <w:p>
             <w:pPr>
+              <w:pStyle w:val="Normal"/>
               <w:jc w:val="left"/>
               <w:pBdr>
                 <w:bottom w:val="none" w:sz="0" w:space="0" w:color="000000"/>
@@ -10633,6 +10721,7 @@
           </w:tcPr>
           <w:p>
             <w:pPr>
+              <w:pStyle w:val="Normal"/>
               <w:jc w:val="left"/>
               <w:pBdr>
                 <w:bottom w:val="none" w:sz="0" w:space="0" w:color="000000"/>
@@ -10673,7 +10762,6 @@
         <w:trPr>
           <w:trHeight w:val="360" w:hRule="auto"/>
         </w:trPr>
-        body1
         <w:tc>
           <w:tcPr>
             <w:tcBorders>
@@ -10693,6 +10781,7 @@
           </w:tcPr>
           <w:p>
             <w:pPr>
+              <w:pStyle w:val="Normal"/>
               <w:jc w:val="left"/>
               <w:pBdr>
                 <w:bottom w:val="none" w:sz="0" w:space="0" w:color="000000"/>
@@ -10747,6 +10836,7 @@
           </w:tcPr>
           <w:p>
             <w:pPr>
+              <w:pStyle w:val="Normal"/>
               <w:jc w:val="left"/>
               <w:pBdr>
                 <w:bottom w:val="none" w:sz="0" w:space="0" w:color="000000"/>
@@ -10801,6 +10891,7 @@
           </w:tcPr>
           <w:p>
             <w:pPr>
+              <w:pStyle w:val="Normal"/>
               <w:jc w:val="left"/>
               <w:pBdr>
                 <w:bottom w:val="none" w:sz="0" w:space="0" w:color="000000"/>
@@ -10841,7 +10932,6 @@
         <w:trPr>
           <w:trHeight w:val="360" w:hRule="auto"/>
         </w:trPr>
-        body2
         <w:tc>
           <w:tcPr>
             <w:tcBorders>
@@ -10861,6 +10951,7 @@
           </w:tcPr>
           <w:p>
             <w:pPr>
+              <w:pStyle w:val="Normal"/>
               <w:jc w:val="left"/>
               <w:pBdr>
                 <w:bottom w:val="none" w:sz="0" w:space="0" w:color="000000"/>
@@ -10915,6 +11006,7 @@
           </w:tcPr>
           <w:p>
             <w:pPr>
+              <w:pStyle w:val="Normal"/>
               <w:jc w:val="left"/>
               <w:pBdr>
                 <w:bottom w:val="none" w:sz="0" w:space="0" w:color="000000"/>
@@ -10969,6 +11061,7 @@
           </w:tcPr>
           <w:p>
             <w:pPr>
+              <w:pStyle w:val="Normal"/>
               <w:jc w:val="left"/>
               <w:pBdr>
                 <w:bottom w:val="none" w:sz="0" w:space="0" w:color="000000"/>
@@ -11009,7 +11102,6 @@
         <w:trPr>
           <w:trHeight w:val="360" w:hRule="auto"/>
         </w:trPr>
-        body3
         <w:tc>
           <w:tcPr>
             <w:tcBorders>
@@ -11029,6 +11121,7 @@
           </w:tcPr>
           <w:p>
             <w:pPr>
+              <w:pStyle w:val="Normal"/>
               <w:jc w:val="left"/>
               <w:pBdr>
                 <w:bottom w:val="none" w:sz="0" w:space="0" w:color="000000"/>
@@ -11083,6 +11176,7 @@
           </w:tcPr>
           <w:p>
             <w:pPr>
+              <w:pStyle w:val="Normal"/>
               <w:jc w:val="left"/>
               <w:pBdr>
                 <w:bottom w:val="none" w:sz="0" w:space="0" w:color="000000"/>
@@ -11137,6 +11231,7 @@
           </w:tcPr>
           <w:p>
             <w:pPr>
+              <w:pStyle w:val="Normal"/>
               <w:jc w:val="left"/>
               <w:pBdr>
                 <w:bottom w:val="none" w:sz="0" w:space="0" w:color="000000"/>
@@ -11177,7 +11272,6 @@
         <w:trPr>
           <w:trHeight w:val="360" w:hRule="auto"/>
         </w:trPr>
-        body4
         <w:tc>
           <w:tcPr>
             <w:tcBorders>
@@ -11197,6 +11291,7 @@
           </w:tcPr>
           <w:p>
             <w:pPr>
+              <w:pStyle w:val="Normal"/>
               <w:jc w:val="left"/>
               <w:pBdr>
                 <w:bottom w:val="none" w:sz="0" w:space="0" w:color="000000"/>
@@ -11251,6 +11346,7 @@
           </w:tcPr>
           <w:p>
             <w:pPr>
+              <w:pStyle w:val="Normal"/>
               <w:jc w:val="left"/>
               <w:pBdr>
                 <w:bottom w:val="none" w:sz="0" w:space="0" w:color="000000"/>
@@ -11305,6 +11401,7 @@
           </w:tcPr>
           <w:p>
             <w:pPr>
+              <w:pStyle w:val="Normal"/>
               <w:jc w:val="left"/>
               <w:pBdr>
                 <w:bottom w:val="none" w:sz="0" w:space="0" w:color="000000"/>
@@ -11345,7 +11442,6 @@
         <w:trPr>
           <w:trHeight w:val="360" w:hRule="auto"/>
         </w:trPr>
-        body5
         <w:tc>
           <w:tcPr>
             <w:tcBorders>
@@ -11365,6 +11461,7 @@
           </w:tcPr>
           <w:p>
             <w:pPr>
+              <w:pStyle w:val="Normal"/>
               <w:jc w:val="left"/>
               <w:pBdr>
                 <w:bottom w:val="none" w:sz="0" w:space="0" w:color="000000"/>
@@ -11419,6 +11516,7 @@
           </w:tcPr>
           <w:p>
             <w:pPr>
+              <w:pStyle w:val="Normal"/>
               <w:jc w:val="left"/>
               <w:pBdr>
                 <w:bottom w:val="none" w:sz="0" w:space="0" w:color="000000"/>
@@ -11473,6 +11571,7 @@
           </w:tcPr>
           <w:p>
             <w:pPr>
+              <w:pStyle w:val="Normal"/>
               <w:jc w:val="left"/>
               <w:pBdr>
                 <w:bottom w:val="none" w:sz="0" w:space="0" w:color="000000"/>
@@ -11513,7 +11612,6 @@
         <w:trPr>
           <w:trHeight w:val="360" w:hRule="auto"/>
         </w:trPr>
-        body6
         <w:tc>
           <w:tcPr>
             <w:tcBorders>
@@ -11533,6 +11631,7 @@
           </w:tcPr>
           <w:p>
             <w:pPr>
+              <w:pStyle w:val="Normal"/>
               <w:jc w:val="left"/>
               <w:pBdr>
                 <w:bottom w:val="none" w:sz="0" w:space="0" w:color="000000"/>
@@ -11587,6 +11686,7 @@
           </w:tcPr>
           <w:p>
             <w:pPr>
+              <w:pStyle w:val="Normal"/>
               <w:jc w:val="left"/>
               <w:pBdr>
                 <w:bottom w:val="none" w:sz="0" w:space="0" w:color="000000"/>
@@ -11641,6 +11741,7 @@
           </w:tcPr>
           <w:p>
             <w:pPr>
+              <w:pStyle w:val="Normal"/>
               <w:jc w:val="left"/>
               <w:pBdr>
                 <w:bottom w:val="none" w:sz="0" w:space="0" w:color="000000"/>
@@ -11681,7 +11782,6 @@
         <w:trPr>
           <w:trHeight w:val="360" w:hRule="auto"/>
         </w:trPr>
-        body7
         <w:tc>
           <w:tcPr>
             <w:tcBorders>
@@ -11701,6 +11801,7 @@
           </w:tcPr>
           <w:p>
             <w:pPr>
+              <w:pStyle w:val="Normal"/>
               <w:jc w:val="left"/>
               <w:pBdr>
                 <w:bottom w:val="none" w:sz="0" w:space="0" w:color="000000"/>
@@ -11755,6 +11856,7 @@
           </w:tcPr>
           <w:p>
             <w:pPr>
+              <w:pStyle w:val="Normal"/>
               <w:jc w:val="left"/>
               <w:pBdr>
                 <w:bottom w:val="none" w:sz="0" w:space="0" w:color="000000"/>
@@ -11809,6 +11911,7 @@
           </w:tcPr>
           <w:p>
             <w:pPr>
+              <w:pStyle w:val="Normal"/>
               <w:jc w:val="left"/>
               <w:pBdr>
                 <w:bottom w:val="none" w:sz="0" w:space="0" w:color="000000"/>
@@ -11849,7 +11952,6 @@
         <w:trPr>
           <w:trHeight w:val="360" w:hRule="auto"/>
         </w:trPr>
-        body8
         <w:tc>
           <w:tcPr>
             <w:tcBorders>
@@ -11869,6 +11971,7 @@
           </w:tcPr>
           <w:p>
             <w:pPr>
+              <w:pStyle w:val="Normal"/>
               <w:jc w:val="left"/>
               <w:pBdr>
                 <w:bottom w:val="none" w:sz="0" w:space="0" w:color="000000"/>
@@ -11923,6 +12026,7 @@
           </w:tcPr>
           <w:p>
             <w:pPr>
+              <w:pStyle w:val="Normal"/>
               <w:jc w:val="left"/>
               <w:pBdr>
                 <w:bottom w:val="none" w:sz="0" w:space="0" w:color="000000"/>
@@ -11977,6 +12081,7 @@
           </w:tcPr>
           <w:p>
             <w:pPr>
+              <w:pStyle w:val="Normal"/>
               <w:jc w:val="left"/>
               <w:pBdr>
                 <w:bottom w:val="none" w:sz="0" w:space="0" w:color="000000"/>

</xml_diff>